<commit_message>
Use numerals instead of colours on the sleeve insignia and add the falcon
Companies are now shown with Arabic numerals and battalions with Roman
numerals; hero names are dropped from the patch and every patch uses a
single red edge that matches the uniform piping. The committee senior
cadet patch carries the university falcon emblem. Also removes a manual
page break that left a blank page after section 3.2.

Co-Authored-By: Claude Opus 5.5 <noreply@anthropic.com>
Claude-Session: https://claude.ai/code/session_019uvV65LEhrLAfTrsruz6Mp
</commit_message>
<xml_diff>
--- a/ubhis-yalgah-temdeg/ubhis_sonsogchiin_horoo_yalgah_temdeg.docx
+++ b/ubhis-yalgah-temdeg/ubhis_sonsogchiin_horoo_yalgah_temdeg.docx
@@ -1198,7 +1198,47 @@
         <w:t xml:space="preserve">ротын ялгах тэмдгийг өөртөө агуулна</w:t>
       </w:r>
       <w:r>
-        <w:t xml:space="preserve">: гадна хөвөө нь батальоны өнгөөр, дээд дугуйд ротын дугаар, доод талд нэрэмжит баатрын нэр байх бөгөөд албан тушаалгүй сонсогч ижил хэлбэрийн ротын тэмдэг зүүнэ. Сонсогч офицерын шугамд (4-р курс) </w:t>
+        <w:t xml:space="preserve">: дээд дугуйд ротыг </w:t>
+      </w:r>
+      <w:r>
+        <w:rPr>
+          <w:b/>
+          <w:bCs/>
+        </w:rPr>
+        <w:t xml:space="preserve">араб тоогоор</w:t>
+      </w:r>
+      <w:r>
+        <w:t xml:space="preserve"> (1–12), доод бичгээр батальоныг </w:t>
+      </w:r>
+      <w:r>
+        <w:rPr>
+          <w:b/>
+          <w:bCs/>
+        </w:rPr>
+        <w:t xml:space="preserve">ром тоогоор</w:t>
+      </w:r>
+      <w:r>
+        <w:t xml:space="preserve"> (I–III) заах бөгөөд бүх нэгжид </w:t>
+      </w:r>
+      <w:r>
+        <w:rPr>
+          <w:b/>
+          <w:bCs/>
+        </w:rPr>
+        <w:t xml:space="preserve">нэг өнгийн улаан хөвөө</w:t>
+      </w:r>
+      <w:r>
+        <w:t xml:space="preserve">тэй. Албан тушаалгүй сонсогч ижил хэлбэрийн ротын тэмдэг зүүнэ. Хорооны ахлах сонсогчийн тэмдэгт ҮБХИС-ийн бэлгэдэл </w:t>
+      </w:r>
+      <w:r>
+        <w:rPr>
+          <w:b/>
+          <w:bCs/>
+        </w:rPr>
+        <w:t xml:space="preserve">шонхор шувуу</w:t>
+      </w:r>
+      <w:r>
+        <w:t xml:space="preserve"> байна. Сонсогч офицерын шугамд (4-р курс) </w:t>
       </w:r>
       <w:r>
         <w:rPr>
@@ -3359,7 +3399,17 @@
         <w:t xml:space="preserve">Ромб, шевроны логик хэвээр.</w:t>
       </w:r>
       <w:r>
-        <w:t xml:space="preserve"> Алтлаг ромб — сонсогч офицерын шугам, мөнгөлөг шеврон — сонсогч түрүүчийн шугам, тоо — нэгжийн түвшин, алтан хүрээ — дарга, нуман тууз — ахлах түрүүч, сүлд навч — хорооны ахлах сонсогч.</w:t>
+        <w:t xml:space="preserve"> Алтлаг ромб — сонсогч офицерын шугам, мөнгөлөг шеврон — сонсогч түрүүчийн шугам, тоо — нэгжийн түвшин, алтан хүрээ — дарга, нуман тууз — ахлах түрүүч, сүлд навч ба ҮБХИС-ийн бэлгэдэл </w:t>
+      </w:r>
+      <w:r>
+        <w:rPr>
+          <w:b/>
+          <w:bCs/>
+        </w:rPr>
+        <w:t xml:space="preserve">шонхор шувуу</w:t>
+      </w:r>
+      <w:r>
+        <w:t xml:space="preserve"> — хорооны ахлах сонсогч.</w:t>
       </w:r>
     </w:p>
     <w:p>
@@ -3399,7 +3449,27 @@
         <w:t xml:space="preserve">Ротын тэмдэг нэгтгэгдэнэ.</w:t>
       </w:r>
       <w:r>
-        <w:t xml:space="preserve"> Нэрэмжит ротын ялгах тэмдгийг ханцуйн тэмдэгт оруулна: гадна хөвөө — батальоны өнгө, дээд дугуй — ротын дугаар, доод бичиг — нэрэмжит баатрын нэр. Албан тушаалгүй сонсогч ижил хэлбэрийн ротын тэмдэг зүүх тул баруун ханцуйнд үргэлж нэг л тэмдэг байна.</w:t>
+        <w:t xml:space="preserve"> Нэрэмжит ротын ялгах тэмдгийг ханцуйн тэмдэгт оруулна: рот — </w:t>
+      </w:r>
+      <w:r>
+        <w:rPr>
+          <w:b/>
+          <w:bCs/>
+        </w:rPr>
+        <w:t xml:space="preserve">араб тоо</w:t>
+      </w:r>
+      <w:r>
+        <w:t xml:space="preserve"> (1–12), батальон — </w:t>
+      </w:r>
+      <w:r>
+        <w:rPr>
+          <w:b/>
+          <w:bCs/>
+        </w:rPr>
+        <w:t xml:space="preserve">ром тоо</w:t>
+      </w:r>
+      <w:r>
+        <w:t xml:space="preserve"> (I–III). Баатрын нэрийг тэмдэг дээр бичихгүй; түүнийг ротын туг, байр, самбарт мөнхжүүлнэ. Албан тушаалгүй сонсогч ижил хэлбэрийн ротын тэмдэг зүүх тул баруун ханцуйнд үргэлж нэг л тэмдэг байна.</w:t>
       </w:r>
     </w:p>
     <w:p>
@@ -3416,10 +3486,20 @@
           <w:b/>
           <w:bCs/>
         </w:rPr>
-        <w:t xml:space="preserve">Одоогийн хувцастай зохицно.</w:t>
-      </w:r>
-      <w:r>
-        <w:t xml:space="preserve"> Батальоны улаан, хөх, алтлаг шар хөвөө нь дүрэмт хувцасны улаан кант, Төрийн далбааны өнгөтэй нийцэж, хар хөх даавуун дээр тод харагдана. Одоогийн албан ёсны тэмдгүүд (Төрийн далбаа, курсийн тэмдэг, ханцуйн тэмдэг) байршлаа хэвээр хадгална.</w:t>
+        <w:t xml:space="preserve">Нэг өнгө.</w:t>
+      </w:r>
+      <w:r>
+        <w:t xml:space="preserve"> Нэгжүүдийг олон өнгөөр ялгахгүй, зөвхөн тоогоор ялгана. Бүх тэмдгийн хөвөө нь дүрэмт хувцасны улаан кант, малгайн улаан туузтай зохицсон </w:t>
+      </w:r>
+      <w:r>
+        <w:rPr>
+          <w:b/>
+          <w:bCs/>
+        </w:rPr>
+        <w:t xml:space="preserve">нэг өнгийн улаан</w:t>
+      </w:r>
+      <w:r>
+        <w:t xml:space="preserve"> бөгөөд хар хөх даавуун дээр тод харагдана. Одоогийн албан ёсны тэмдгүүд (Төрийн далбаа, курсийн тэмдэг, ханцуйн тэмдэг) байршлаа хэвээр хадгална.</w:t>
       </w:r>
     </w:p>
     <w:p>
@@ -3485,30 +3565,40 @@
           <w:b/>
           <w:bCs/>
         </w:rPr>
-        <w:t xml:space="preserve">дээд дугуйд нэгжийн дугаар</w:t>
-      </w:r>
-      <w:r>
-        <w:t xml:space="preserve"> (ротын түвшинд ротын дугаар 1–12, батальоны түвшинд I–III, хорооны түвшинд «СХ»), </w:t>
+        <w:t xml:space="preserve">дээд дугуйд өөрийн нэгж</w:t>
+      </w:r>
+      <w:r>
+        <w:t xml:space="preserve"> (ротын түвшинд ротын дугаар араб тоогоор 1–12, батальоны түвшинд ром тоогоор I–III, хорооны түвшинд «СХ»), </w:t>
       </w:r>
       <w:r>
         <w:rPr>
           <w:b/>
           <w:bCs/>
         </w:rPr>
-        <w:t xml:space="preserve">доод талд нэрэмжит баатрын нэр</w:t>
-      </w:r>
-      <w:r>
-        <w:t xml:space="preserve"> (батальоны түвшинд «N-Р БАТАЛЬОН», хорооны түвшинд «ХОРОО»), </w:t>
+        <w:t xml:space="preserve">доод бичигт харьяа дээд нэгж</w:t>
+      </w:r>
+      <w:r>
+        <w:t xml:space="preserve"> (ротын түвшинд «I БАТАЛЬОН» гэх мэт ром тоогоор, батальоны түвшинд «БАТАЛЬОН», хорооны түвшинд «ХОРОО») байна. Хорооны ахлах сонсогчийн тэмдэгт дугуйн оронд ҮБХИС-ийн бэлгэдэл </w:t>
       </w:r>
       <w:r>
         <w:rPr>
           <w:b/>
           <w:bCs/>
         </w:rPr>
-        <w:t xml:space="preserve">гадна хөвөө нь батальоны өнгөөр</w:t>
-      </w:r>
-      <w:r>
-        <w:t xml:space="preserve"> (1-р — улаан, 2-р — хөх, 3-р — алтлаг шар, хорооны түвшин — цагаан) байна.</w:t>
+        <w:t xml:space="preserve">шонхор шувуу</w:t>
+      </w:r>
+      <w:r>
+        <w:t xml:space="preserve"> байна. Хөвөө нь бүх тэмдэгт </w:t>
+      </w:r>
+      <w:r>
+        <w:rPr>
+          <w:b/>
+          <w:bCs/>
+        </w:rPr>
+        <w:t xml:space="preserve">нэг өнгийн улаан</w:t>
+      </w:r>
+      <w:r>
+        <w:t xml:space="preserve">.</w:t>
       </w:r>
     </w:p>
     <w:p>
@@ -3551,25 +3641,20 @@
           <w:b/>
           <w:bCs/>
         </w:rPr>
-        <w:t xml:space="preserve">Дээд дугуй</w:t>
-      </w:r>
-      <w:r>
-        <w:t xml:space="preserve"> нь аль нэгжийнх болохыг, </w:t>
+        <w:t xml:space="preserve">Араб тоо</w:t>
+      </w:r>
+      <w:r>
+        <w:t xml:space="preserve"> нь ротыг, </w:t>
       </w:r>
       <w:r>
         <w:rPr>
           <w:b/>
           <w:bCs/>
         </w:rPr>
-        <w:t xml:space="preserve">хөвөөний өнгө</w:t>
+        <w:t xml:space="preserve">ром тоо</w:t>
       </w:r>
       <w:r>
         <w:t xml:space="preserve"> нь батальоныг заана.</w:t>
-      </w:r>
-    </w:p>
-    <w:p>
-      <w:r>
-        <w:br w:type="page"/>
       </w:r>
     </w:p>
     <w:p>
@@ -4027,7 +4112,7 @@
                 <w:sz w:val="19"/>
                 <w:szCs w:val="19"/>
               </w:rPr>
-              <w:t xml:space="preserve">4 ромб + алтан хүрээ + сүлд навч</w:t>
+              <w:t xml:space="preserve">4 ромб + алтан хүрээ + сүлд навч + шонхор шувуу</w:t>
             </w:r>
           </w:p>
         </w:tc>
@@ -6909,14 +6994,14 @@
                 <w:sz w:val="19"/>
                 <w:szCs w:val="19"/>
               </w:rPr>
-              <w:t xml:space="preserve">3 мм хөвөө — батальоны өнгөөр</w:t>
-            </w:r>
-            <w:r>
-              <w:rPr>
-                <w:sz w:val="19"/>
-                <w:szCs w:val="19"/>
-              </w:rPr>
-              <w:t xml:space="preserve"> (улаан, хөх, алтлаг шар; хороо — цагаан), мерроу оёдол</w:t>
+              <w:t xml:space="preserve">3 мм улаан хөвөө</w:t>
+            </w:r>
+            <w:r>
+              <w:rPr>
+                <w:sz w:val="19"/>
+                <w:szCs w:val="19"/>
+              </w:rPr>
+              <w:t xml:space="preserve"> (бүх нэгжид нэг өнгө), мерроу оёдол</w:t>
             </w:r>
           </w:p>
         </w:tc>
@@ -6948,7 +7033,7 @@
                 <w:sz w:val="19"/>
                 <w:szCs w:val="19"/>
               </w:rPr>
-              <w:t xml:space="preserve">Эрээн хувцасны ижил хээтэй (эсвэл олив ногоон) даавуу, хар хүрэн хөвөө; батальоны өнгийг бараан нарийн хүрээгээр</w:t>
+              <w:t xml:space="preserve">Эрээн хувцасны ижил хээтэй (эсвэл олив ногоон) даавуу, хар хүрэн хөвөө</w:t>
             </w:r>
           </w:p>
         </w:tc>
@@ -7335,7 +7420,7 @@
                 <w:sz w:val="19"/>
                 <w:szCs w:val="19"/>
               </w:rPr>
-              <w:t xml:space="preserve">Ротын дугаар, баатрын нэр</w:t>
+              <w:t xml:space="preserve">Нэгжийн тоо</w:t>
             </w:r>
           </w:p>
         </w:tc>
@@ -7364,7 +7449,7 @@
                 <w:sz w:val="19"/>
                 <w:szCs w:val="19"/>
               </w:rPr>
-              <w:t xml:space="preserve">Алтлаг дугаар (дугуйн хүрээ — батальоны өнгө); баатрын нэр цагаан утсаар</w:t>
+              <w:t xml:space="preserve">Рот — араб тоо, батальон — ром тоо; алтлаг утсаар. Хорооны ахлах сонсогч — алтлаг шонхор шувуу</w:t>
             </w:r>
           </w:p>
         </w:tc>
@@ -7396,7 +7481,7 @@
                 <w:sz w:val="19"/>
                 <w:szCs w:val="19"/>
               </w:rPr>
-              <w:t xml:space="preserve">Хүрэн шар дугаар (бараан өнгийн дугуй хүрээ); нэр хүрэн шар эсвэл хар утсаар</w:t>
+              <w:t xml:space="preserve">Ижил, хүрэн шар утсаар</w:t>
             </w:r>
           </w:p>
         </w:tc>
@@ -8150,37 +8235,27 @@
         <w:t xml:space="preserve">ханцуйн тэмдэгт нэгтгэнэ</w:t>
       </w:r>
       <w:r>
-        <w:t xml:space="preserve"> (Зураг 6). Албан тушаалгүй сонсогчийн ротын тэмдэг нь албан тушаалын тэмдэгтэй ижил хэлбэр, хэмжээтэй (6 × 9 см) бөгөөд голд нь том ротын дугаар, доод талд нэрэмжит баатрын нэр байна. Гадна хөвөөний өнгө нь батальоныг заана: 1-р батальон — </w:t>
+        <w:t xml:space="preserve"> (Зураг 6). Албан тушаалгүй сонсогчийн ротын тэмдэг нь албан тушаалын тэмдэгтэй ижил хэлбэр, хэмжээтэй (6 × 9 см) бөгөөд голд нь том </w:t>
       </w:r>
       <w:r>
         <w:rPr>
           <w:b/>
           <w:bCs/>
         </w:rPr>
-        <w:t xml:space="preserve">улаан</w:t>
-      </w:r>
-      <w:r>
-        <w:t xml:space="preserve">, 2-р батальон — </w:t>
+        <w:t xml:space="preserve">араб тоогоор</w:t>
+      </w:r>
+      <w:r>
+        <w:t xml:space="preserve"> ротын дугаар, доод талд </w:t>
       </w:r>
       <w:r>
         <w:rPr>
           <w:b/>
           <w:bCs/>
         </w:rPr>
-        <w:t xml:space="preserve">хөх</w:t>
-      </w:r>
-      <w:r>
-        <w:t xml:space="preserve">, 3-р батальон — </w:t>
-      </w:r>
-      <w:r>
-        <w:rPr>
-          <w:b/>
-          <w:bCs/>
-        </w:rPr>
-        <w:t xml:space="preserve">алтлаг шар</w:t>
-      </w:r>
-      <w:r>
-        <w:t xml:space="preserve">. Албан тушаалд томилогдвол ромб, шеврон бүхий тэмдгээр сольж, ротын дугаар нь дээд дугуйд шилжинэ. Ингэснээр баруун ханцуйнд нэг л тэмдэг зүүгдэж, ханцуй ачаалал багатай болно.</w:t>
+        <w:t xml:space="preserve">ром тоогоор</w:t>
+      </w:r>
+      <w:r>
+        <w:t xml:space="preserve"> батальон (жишээ нь «II БАТАЛЬОН») байна. Нэгжүүдийг өнгөөр биш, зөвхөн тоогоор ялгах тул бүх тэмдэг нэг өнгийн улаан хөвөөтэй. Нэрэмжит баатрын нэрийг тэмдэг дээр бичихгүй, ротын туг, байр, самбарт мөнхжүүлнэ. Албан тушаалд томилогдвол ромб, шеврон бүхий тэмдгээр сольж, ротын дугаар нь дээд дугуйд шилжинэ. Ингэснээр баруун ханцуйнд нэг л тэмдэг зүүгдэж, ханцуй ачаалал багатай болно.</w:t>
       </w:r>
     </w:p>
     <w:p>
@@ -15060,7 +15135,7 @@
           <w:b/>
           <w:bCs/>
         </w:rPr>
-        <w:t xml:space="preserve">албаны (хар хөх суурь, дарааст товч) ба эрээн (бүдэг өнгө, наалт)</w:t>
+        <w:t xml:space="preserve">албаны (хар хөх суурь, улаан хөвөө, дарааст товч) ба эрээн (бүдэг өнгө, наалт)</w:t>
       </w:r>
       <w:r>
         <w:t xml:space="preserve"> хоёр хувилбартай, </w:t>
@@ -15070,10 +15145,20 @@
           <w:b/>
           <w:bCs/>
         </w:rPr>
-        <w:t xml:space="preserve">ротын дугаар, батальоны өнгө, нэрэмжит баатрын нэрийг агуулсан</w:t>
-      </w:r>
-      <w:r>
-        <w:t xml:space="preserve"> байдлаар нэвтрүүлж, </w:t>
+        <w:t xml:space="preserve">ротыг араб тоогоор, батальоныг ром тоогоор</w:t>
+      </w:r>
+      <w:r>
+        <w:t xml:space="preserve"> илэрхийлсэн, хорооны ахлах сонсогчийнхыг </w:t>
+      </w:r>
+      <w:r>
+        <w:rPr>
+          <w:b/>
+          <w:bCs/>
+        </w:rPr>
+        <w:t xml:space="preserve">шонхор шувуугаар</w:t>
+      </w:r>
+      <w:r>
+        <w:t xml:space="preserve"> тэмдэглэсэн байдлаар нэвтрүүлж, </w:t>
       </w:r>
       <w:r>
         <w:rPr>

</xml_diff>

<commit_message>
Use the university logo falcon on the committee senior cadet insignia
The falcon is cut out of the ҮБХИС logo (gold for service dress, tan for
camouflage) and placed above four rhombs inside the commander frame; the
laurel wreath is dropped and the gap between the legs is opened so the
legs read separately. Adds a standalone figure of the insignia.

Co-Authored-By: Claude Opus 5.5 <noreply@anthropic.com>
Claude-Session: https://claude.ai/code/session_019uvV65LEhrLAfTrsruz6Mp
</commit_message>
<xml_diff>
--- a/ubhis-yalgah-temdeg/ubhis_sonsogchiin_horoo_yalgah_temdeg.docx
+++ b/ubhis-yalgah-temdeg/ubhis_sonsogchiin_horoo_yalgah_temdeg.docx
@@ -3399,7 +3399,7 @@
         <w:t xml:space="preserve">Ромб, шевроны логик хэвээр.</w:t>
       </w:r>
       <w:r>
-        <w:t xml:space="preserve"> Алтлаг ромб — сонсогч офицерын шугам, мөнгөлөг шеврон — сонсогч түрүүчийн шугам, тоо — нэгжийн түвшин, алтан хүрээ — дарга, нуман тууз — ахлах түрүүч, сүлд навч ба ҮБХИС-ийн бэлгэдэл </w:t>
+        <w:t xml:space="preserve"> Алтлаг ромб — сонсогч офицерын шугам, мөнгөлөг шеврон — сонсогч түрүүчийн шугам, тоо — нэгжийн түвшин, алтан хүрээ — дарга, нуман тууз — ахлах түрүүч, ҮБХИС-ийн логоны </w:t>
       </w:r>
       <w:r>
         <w:rPr>
@@ -3578,7 +3578,17 @@
         <w:t xml:space="preserve">доод бичигт харьяа дээд нэгж</w:t>
       </w:r>
       <w:r>
-        <w:t xml:space="preserve"> (ротын түвшинд «I БАТАЛЬОН» гэх мэт ром тоогоор, батальоны түвшинд «БАТАЛЬОН», хорооны түвшинд «ХОРОО») байна. Хорооны ахлах сонсогчийн тэмдэгт дугуйн оронд ҮБХИС-ийн бэлгэдэл </w:t>
+        <w:t xml:space="preserve"> (ротын түвшинд «I БАТАЛЬОН» гэх мэт ром тоогоор, батальоны түвшинд «БАТАЛЬОН», хорооны түвшинд «ХОРОО») байна. </w:t>
+      </w:r>
+      <w:r>
+        <w:rPr>
+          <w:b/>
+          <w:bCs/>
+        </w:rPr>
+        <w:t xml:space="preserve">Хорооны ахлах сонсогчийн тэмдэг</w:t>
+      </w:r>
+      <w:r>
+        <w:t xml:space="preserve"> нь алтан хүрээтэй, дээд хэсэгтээ ҮБХИС-ийн логоноос авсан </w:t>
       </w:r>
       <w:r>
         <w:rPr>
@@ -3588,7 +3598,17 @@
         <w:t xml:space="preserve">шонхор шувуу</w:t>
       </w:r>
       <w:r>
-        <w:t xml:space="preserve"> байна. Хөвөө нь бүх тэмдэгт </w:t>
+        <w:t xml:space="preserve">, доор нь </w:t>
+      </w:r>
+      <w:r>
+        <w:rPr>
+          <w:b/>
+          <w:bCs/>
+        </w:rPr>
+        <w:t xml:space="preserve">4 алтлаг ромб</w:t>
+      </w:r>
+      <w:r>
+        <w:t xml:space="preserve">-той (сүлд навчгүй) байна. Хөвөө нь бүх тэмдэгт </w:t>
       </w:r>
       <w:r>
         <w:rPr>
@@ -4112,7 +4132,7 @@
                 <w:sz w:val="19"/>
                 <w:szCs w:val="19"/>
               </w:rPr>
-              <w:t xml:space="preserve">4 ромб + алтан хүрээ + сүлд навч + шонхор шувуу</w:t>
+              <w:t xml:space="preserve">4 ромб + алтан хүрээ + шонхор шувуу</w:t>
             </w:r>
           </w:p>
         </w:tc>

</xml_diff>

<commit_message>
Add award badge designs and section 4.7
Designs the athlete, student and General Sukhbaatar honour badges in the
same antique-brass and enamel style as the existing best-graduate falcon
medal (kept as is, cut out of the photo), and adds section 4.7 with the
badge sheet, their symbolism and award criteria.

Co-Authored-By: Claude Opus 5.5 <noreply@anthropic.com>
Claude-Session: https://claude.ai/code/session_019uvV65LEhrLAfTrsruz6Mp
</commit_message>
<xml_diff>
--- a/ubhis-yalgah-temdeg/ubhis_sonsogchiin_horoo_yalgah_temdeg.docx
+++ b/ubhis-yalgah-temdeg/ubhis_sonsogchiin_horoo_yalgah_temdeg.docx
@@ -871,6 +871,37 @@
         </w:p>
         <w:p>
           <w:pPr>
+            <w:pStyle w:val="TOC2"/>
+            <w:tabs>
+              <w:tab w:val="right" w:leader="dot" w:pos="9628"/>
+            </w:tabs>
+            <w:rPr>
+              <w:noProof/>
+            </w:rPr>
+          </w:pPr>
+          <w:hyperlink w:anchor="_Toc244003099" w:history="1">
+            <w:r>
+              <w:rPr>
+                <w:rStyle w:val="Hyperlink"/>
+                <w:noProof/>
+              </w:rPr>
+              <w:t>4.7. Шагналын тэмдгийн загвар</w:t>
+            </w:r>
+            <w:r>
+              <w:rPr>
+                <w:noProof/>
+              </w:rPr>
+              <w:tab/>
+              <w:fldChar w:fldCharType="begin"/>
+              <w:instrText xml:space="preserve"> PAGEREF _Toc244003099 \h </w:instrText>
+              <w:fldChar w:fldCharType="separate"/>
+              <w:t>1</w:t>
+              <w:fldChar w:fldCharType="end"/>
+            </w:r>
+          </w:hyperlink>
+        </w:p>
+        <w:p>
+          <w:pPr>
             <w:pStyle w:val="TOC1"/>
             <w:tabs>
               <w:tab w:val="right" w:leader="dot" w:pos="9628"/>
@@ -1305,10 +1336,10 @@
           <w:b/>
           <w:bCs/>
         </w:rPr>
-        <w:t xml:space="preserve">Шагналын тэмдэг 4 бүлэгтэй:</w:t>
-      </w:r>
-      <w:r>
-        <w:t xml:space="preserve"> (1) тэргүүний тамирчин тэмдэг, (2) тэргүүний суралцагч тэмдэг, (3) Жанжин Сүхбаатрын хүндэт тэмдэг(4) төгсөлтийн шагнал — Хүндэт сэлэм, Шилдэг төгсөгч шонхор тэмдэг </w:t>
+        <w:t xml:space="preserve">Шагналын тэмдэг 4 төрөлтэй:</w:t>
+      </w:r>
+      <w:r>
+        <w:t xml:space="preserve"> (1) Тэргүүний тамирчин тэмдэг, (2) Тэргүүний суралцагч тэмдэг, (3) Жанжин Сүхбаатарын хүндэт тэмдэг, (4) төгсөлтийн шагнал — Хүндэт сэлэм, Шилдэг төгсөгч шонхор тэмдэг (загварыг 4.7-д үзүүлэв).</w:t>
       </w:r>
     </w:p>
     <w:p>
@@ -11405,6 +11436,801 @@
       </w:tr>
     </w:tbl>
     <w:p>
+      <w:pPr>
+        <w:pStyle w:val="Heading2"/>
+      </w:pPr>
+      <w:bookmarkStart w:id="901" w:name="_Toc244003099"/>
+      <w:r>
+        <w:t xml:space="preserve">4.7. Шагналын тэмдгийн загвар</w:t>
+      </w:r>
+      <w:bookmarkEnd w:id="901"/>
+    </w:p>
+    <w:p>
+      <w:pPr>
+        <w:spacing w:after="120" w:line="300" w:lineRule="auto"/>
+        <w:jc w:val="both"/>
+      </w:pPr>
+      <w:r>
+        <w:t xml:space="preserve">Дөрвөн шагналын тэмдгийг одоо хэрэглэж буй </w:t>
+      </w:r>
+      <w:r>
+        <w:rPr>
+          <w:b/>
+          <w:bCs/>
+        </w:rPr>
+        <w:t xml:space="preserve">«Шилдэг төгсөгч» шонхор тэмдэгтэй ижил хийцээр</w:t>
+      </w:r>
+      <w:r>
+        <w:t xml:space="preserve"> — хуучирсан гуулин өнгийн цутгамал металл, улаан ба хөх паалантайгаар хийнэ. Тэмдэг бүр өөрийн бэлгэдэлтэй бөгөөд «ҮБХИС» бичиг, улаан тууз нь нэгдмэл байдлыг хангана (Зураг 10, Хүснэгт 7).</w:t>
+      </w:r>
+    </w:p>
+    <w:p>
+      <w:pPr>
+        <w:keepNext/>
+        <w:spacing w:before="120" w:after="40"/>
+        <w:jc w:val="center"/>
+      </w:pPr>
+      <w:r>
+        <w:rPr>
+          <w:noProof/>
+        </w:rPr>
+        <w:drawing>
+          <wp:inline distT="0" distB="0" distL="0" distR="0">
+            <wp:extent cx="6115050" cy="2547937"/>
+            <wp:effectExtent l="0" t="0" r="0" b="0"/>
+            <wp:docPr id="2146811056" name="Picture 2146811056"/>
+            <wp:cNvGraphicFramePr>
+              <a:graphicFrameLocks xmlns:a="http://schemas.openxmlformats.org/drawingml/2006/main" noChangeAspect="1"/>
+            </wp:cNvGraphicFramePr>
+            <a:graphic xmlns:a="http://schemas.openxmlformats.org/drawingml/2006/main">
+              <a:graphicData uri="http://schemas.openxmlformats.org/drawingml/2006/picture">
+                <pic:pic xmlns:pic="http://schemas.openxmlformats.org/drawingml/2006/picture">
+                  <pic:nvPicPr>
+                    <pic:cNvPr id="0" name=""/>
+                    <pic:cNvPicPr>
+                      <a:picLocks noChangeAspect="1" noChangeArrowheads="1"/>
+                    </pic:cNvPicPr>
+                  </pic:nvPicPr>
+                  <pic:blipFill>
+                    <a:blip r:embed="rId45"/>
+                    <a:srcRect/>
+                    <a:stretch>
+                      <a:fillRect/>
+                    </a:stretch>
+                  </pic:blipFill>
+                  <pic:spPr bwMode="auto">
+                    <a:xfrm>
+                      <a:off x="0" y="0"/>
+                      <a:ext cx="6115050" cy="2547937"/>
+                    </a:xfrm>
+                    <a:prstGeom prst="rect">
+                      <a:avLst/>
+                    </a:prstGeom>
+                  </pic:spPr>
+                </pic:pic>
+              </a:graphicData>
+            </a:graphic>
+          </wp:inline>
+        </w:drawing>
+      </w:r>
+    </w:p>
+    <w:p>
+      <w:pPr>
+        <w:spacing w:after="200"/>
+        <w:jc w:val="center"/>
+      </w:pPr>
+      <w:r>
+        <w:rPr>
+          <w:i/>
+          <w:iCs/>
+          <w:color w:val="5B6472"/>
+          <w:sz w:val="18"/>
+          <w:szCs w:val="18"/>
+        </w:rPr>
+        <w:t xml:space="preserve">Зураг 10. Шагналын тэмдгийн загвар</w:t>
+      </w:r>
+    </w:p>
+    <w:p>
+      <w:pPr>
+        <w:keepNext/>
+        <w:spacing w:before="160" w:after="80"/>
+      </w:pPr>
+      <w:r>
+        <w:rPr>
+          <w:color w:val="2E4A7D"/>
+          <w:sz w:val="20"/>
+          <w:szCs w:val="20"/>
+        </w:rPr>
+        <w:t xml:space="preserve">Хүснэгт 7. Шагналын тэмдгийн бэлгэдэл ба олгох шалгуур</w:t>
+      </w:r>
+    </w:p>
+    <w:tbl>
+      <w:tblPr>
+        <w:tblW w:w="9638" w:type="dxa"/>
+        <w:tblBorders>
+          <w:top w:val="single" w:sz="4" w:space="0" w:color="auto"/>
+          <w:left w:val="single" w:sz="4" w:space="0" w:color="auto"/>
+          <w:bottom w:val="single" w:sz="4" w:space="0" w:color="auto"/>
+          <w:right w:val="single" w:sz="4" w:space="0" w:color="auto"/>
+          <w:insideH w:val="single" w:sz="4" w:space="0" w:color="auto"/>
+          <w:insideV w:val="single" w:sz="4" w:space="0" w:color="auto"/>
+        </w:tblBorders>
+        <w:tblCellMar>
+          <w:left w:w="10" w:type="dxa"/>
+          <w:right w:w="10" w:type="dxa"/>
+        </w:tblCellMar>
+        <w:tblLook w:val="04A0" w:firstRow="1" w:lastRow="0" w:firstColumn="1" w:lastColumn="0" w:noHBand="0" w:noVBand="1"/>
+      </w:tblPr>
+      <w:tblGrid>
+        <w:gridCol w:w="2038"/>
+        <w:gridCol w:w="3800"/>
+        <w:gridCol w:w="3800"/>
+      </w:tblGrid>
+      <w:tr>
+        <w:tblPrEx>
+          <w:tblCellMar>
+            <w:top w:w="0" w:type="dxa"/>
+            <w:bottom w:w="0" w:type="dxa"/>
+          </w:tblCellMar>
+        </w:tblPrEx>
+        <w:trPr>
+          <w:tblHeader/>
+        </w:trPr>
+        <w:tc>
+          <w:tcPr>
+            <w:tcW w:w="2038" w:type="dxa"/>
+            <w:tcBorders>
+              <w:top w:val="single" w:sz="4" w:space="0" w:color="A9B1BD"/>
+              <w:left w:val="single" w:sz="4" w:space="0" w:color="A9B1BD"/>
+              <w:bottom w:val="single" w:sz="4" w:space="0" w:color="A9B1BD"/>
+              <w:right w:val="single" w:sz="4" w:space="0" w:color="A9B1BD"/>
+            </w:tcBorders>
+            <w:shd w:val="clear" w:color="auto" w:fill="1B2A41"/>
+            <w:tcMar>
+              <w:top w:w="70" w:type="dxa"/>
+              <w:left w:w="100" w:type="dxa"/>
+              <w:bottom w:w="70" w:type="dxa"/>
+              <w:right w:w="100" w:type="dxa"/>
+            </w:tcMar>
+            <w:vAlign w:val="center"/>
+          </w:tcPr>
+          <w:p>
+            <w:pPr>
+              <w:spacing w:after="40" w:line="264" w:lineRule="auto"/>
+            </w:pPr>
+            <w:r>
+              <w:rPr>
+                <w:color w:val="FFFFFF"/>
+                <w:sz w:val="19"/>
+                <w:szCs w:val="19"/>
+              </w:rPr>
+              <w:t xml:space="preserve">Тэмдэг</w:t>
+            </w:r>
+          </w:p>
+        </w:tc>
+        <w:tc>
+          <w:tcPr>
+            <w:tcW w:w="3800" w:type="dxa"/>
+            <w:tcBorders>
+              <w:top w:val="single" w:sz="4" w:space="0" w:color="A9B1BD"/>
+              <w:left w:val="single" w:sz="4" w:space="0" w:color="A9B1BD"/>
+              <w:bottom w:val="single" w:sz="4" w:space="0" w:color="A9B1BD"/>
+              <w:right w:val="single" w:sz="4" w:space="0" w:color="A9B1BD"/>
+            </w:tcBorders>
+            <w:shd w:val="clear" w:color="auto" w:fill="1B2A41"/>
+            <w:tcMar>
+              <w:top w:w="70" w:type="dxa"/>
+              <w:left w:w="100" w:type="dxa"/>
+              <w:bottom w:w="70" w:type="dxa"/>
+              <w:right w:w="100" w:type="dxa"/>
+            </w:tcMar>
+            <w:vAlign w:val="center"/>
+          </w:tcPr>
+          <w:p>
+            <w:pPr>
+              <w:spacing w:after="40" w:line="264" w:lineRule="auto"/>
+            </w:pPr>
+            <w:r>
+              <w:rPr>
+                <w:color w:val="FFFFFF"/>
+                <w:sz w:val="19"/>
+                <w:szCs w:val="19"/>
+              </w:rPr>
+              <w:t xml:space="preserve">Бэлгэдэл, хийц</w:t>
+            </w:r>
+          </w:p>
+        </w:tc>
+        <w:tc>
+          <w:tcPr>
+            <w:tcW w:w="3800" w:type="dxa"/>
+            <w:tcBorders>
+              <w:top w:val="single" w:sz="4" w:space="0" w:color="A9B1BD"/>
+              <w:left w:val="single" w:sz="4" w:space="0" w:color="A9B1BD"/>
+              <w:bottom w:val="single" w:sz="4" w:space="0" w:color="A9B1BD"/>
+              <w:right w:val="single" w:sz="4" w:space="0" w:color="A9B1BD"/>
+            </w:tcBorders>
+            <w:shd w:val="clear" w:color="auto" w:fill="1B2A41"/>
+            <w:tcMar>
+              <w:top w:w="70" w:type="dxa"/>
+              <w:left w:w="100" w:type="dxa"/>
+              <w:bottom w:w="70" w:type="dxa"/>
+              <w:right w:w="100" w:type="dxa"/>
+            </w:tcMar>
+            <w:vAlign w:val="center"/>
+          </w:tcPr>
+          <w:p>
+            <w:pPr>
+              <w:spacing w:after="40" w:line="264" w:lineRule="auto"/>
+            </w:pPr>
+            <w:r>
+              <w:rPr>
+                <w:color w:val="FFFFFF"/>
+                <w:sz w:val="19"/>
+                <w:szCs w:val="19"/>
+              </w:rPr>
+              <w:t xml:space="preserve">Олгох шалгуур</w:t>
+            </w:r>
+          </w:p>
+        </w:tc>
+      </w:tr>
+      <w:tr>
+        <w:tblPrEx>
+          <w:tblCellMar>
+            <w:top w:w="0" w:type="dxa"/>
+            <w:bottom w:w="0" w:type="dxa"/>
+          </w:tblCellMar>
+        </w:tblPrEx>
+        <w:trPr>
+          <w:cantSplit/>
+        </w:trPr>
+        <w:tc>
+          <w:tcPr>
+            <w:tcW w:w="2038" w:type="dxa"/>
+            <w:tcBorders>
+              <w:top w:val="single" w:sz="4" w:space="0" w:color="A9B1BD"/>
+              <w:left w:val="single" w:sz="4" w:space="0" w:color="A9B1BD"/>
+              <w:bottom w:val="single" w:sz="4" w:space="0" w:color="A9B1BD"/>
+              <w:right w:val="single" w:sz="4" w:space="0" w:color="A9B1BD"/>
+            </w:tcBorders>
+            <w:shd w:val="clear" w:color="auto" w:fill="EEF0F4"/>
+            <w:tcMar>
+              <w:top w:w="70" w:type="dxa"/>
+              <w:left w:w="100" w:type="dxa"/>
+              <w:bottom w:w="70" w:type="dxa"/>
+              <w:right w:w="100" w:type="dxa"/>
+            </w:tcMar>
+          </w:tcPr>
+          <w:p>
+            <w:pPr>
+              <w:spacing w:after="40" w:line="264" w:lineRule="auto"/>
+            </w:pPr>
+            <w:r>
+              <w:rPr>
+                <w:b/>
+                <w:bCs/>
+                <w:sz w:val="19"/>
+                <w:szCs w:val="19"/>
+              </w:rPr>
+              <w:t xml:space="preserve">1. Тэргүүний тамирчин тэмдэг</w:t>
+            </w:r>
+          </w:p>
+        </w:tc>
+        <w:tc>
+          <w:tcPr>
+            <w:tcW w:w="3800" w:type="dxa"/>
+            <w:tcBorders>
+              <w:top w:val="single" w:sz="4" w:space="0" w:color="A9B1BD"/>
+              <w:left w:val="single" w:sz="4" w:space="0" w:color="A9B1BD"/>
+              <w:bottom w:val="single" w:sz="4" w:space="0" w:color="A9B1BD"/>
+              <w:right w:val="single" w:sz="4" w:space="0" w:color="A9B1BD"/>
+            </w:tcBorders>
+            <w:tcMar>
+              <w:top w:w="70" w:type="dxa"/>
+              <w:left w:w="100" w:type="dxa"/>
+              <w:bottom w:w="70" w:type="dxa"/>
+              <w:right w:w="100" w:type="dxa"/>
+            </w:tcMar>
+          </w:tcPr>
+          <w:p>
+            <w:pPr>
+              <w:spacing w:after="40" w:line="264" w:lineRule="auto"/>
+            </w:pPr>
+            <w:r>
+              <w:rPr>
+                <w:sz w:val="19"/>
+                <w:szCs w:val="19"/>
+              </w:rPr>
+              <w:t xml:space="preserve">Бамбар барьж гүйж буй тамирчин — тэсвэр, ялалтын төлөөх тэмүүлэл; ялалтын </w:t>
+            </w:r>
+            <w:r>
+              <w:rPr>
+                <w:b/>
+                <w:bCs/>
+                <w:sz w:val="19"/>
+                <w:szCs w:val="19"/>
+              </w:rPr>
+              <w:t xml:space="preserve">сүлд навч</w:t>
+            </w:r>
+            <w:r>
+              <w:rPr>
+                <w:sz w:val="19"/>
+                <w:szCs w:val="19"/>
+              </w:rPr>
+              <w:t xml:space="preserve">; хөх паалан. Дугуй, Ø 40 мм.</w:t>
+            </w:r>
+          </w:p>
+        </w:tc>
+        <w:tc>
+          <w:tcPr>
+            <w:tcW w:w="3800" w:type="dxa"/>
+            <w:tcBorders>
+              <w:top w:val="single" w:sz="4" w:space="0" w:color="A9B1BD"/>
+              <w:left w:val="single" w:sz="4" w:space="0" w:color="A9B1BD"/>
+              <w:bottom w:val="single" w:sz="4" w:space="0" w:color="A9B1BD"/>
+              <w:right w:val="single" w:sz="4" w:space="0" w:color="A9B1BD"/>
+            </w:tcBorders>
+            <w:tcMar>
+              <w:top w:w="70" w:type="dxa"/>
+              <w:left w:w="100" w:type="dxa"/>
+              <w:bottom w:w="70" w:type="dxa"/>
+              <w:right w:w="100" w:type="dxa"/>
+            </w:tcMar>
+          </w:tcPr>
+          <w:p>
+            <w:pPr>
+              <w:spacing w:after="40" w:line="264" w:lineRule="auto"/>
+              <w:rPr>
+                <w:lang w:val="ru-RU"/>
+              </w:rPr>
+            </w:pPr>
+            <w:r>
+              <w:rPr>
+                <w:sz w:val="19"/>
+                <w:szCs w:val="19"/>
+              </w:rPr>
+              <w:t xml:space="preserve">Бие бялдрын шалгалтын нийт оноо ≥ 90%, биеийн тамирын дүн «A»; ҮБХИС, Зэвсэгт хүчний аварга шалгаруулах тэмцээнд 1–3-р байр эзэлсэн.</w:t>
+            </w:r>
+          </w:p>
+        </w:tc>
+      </w:tr>
+      <w:tr>
+        <w:tblPrEx>
+          <w:tblCellMar>
+            <w:top w:w="0" w:type="dxa"/>
+            <w:bottom w:w="0" w:type="dxa"/>
+          </w:tblCellMar>
+        </w:tblPrEx>
+        <w:trPr>
+          <w:cantSplit/>
+        </w:trPr>
+        <w:tc>
+          <w:tcPr>
+            <w:tcW w:w="2038" w:type="dxa"/>
+            <w:tcBorders>
+              <w:top w:val="single" w:sz="4" w:space="0" w:color="A9B1BD"/>
+              <w:left w:val="single" w:sz="4" w:space="0" w:color="A9B1BD"/>
+              <w:bottom w:val="single" w:sz="4" w:space="0" w:color="A9B1BD"/>
+              <w:right w:val="single" w:sz="4" w:space="0" w:color="A9B1BD"/>
+            </w:tcBorders>
+            <w:shd w:val="clear" w:color="auto" w:fill="EEF0F4"/>
+            <w:tcMar>
+              <w:top w:w="70" w:type="dxa"/>
+              <w:left w:w="100" w:type="dxa"/>
+              <w:bottom w:w="70" w:type="dxa"/>
+              <w:right w:w="100" w:type="dxa"/>
+            </w:tcMar>
+          </w:tcPr>
+          <w:p>
+            <w:pPr>
+              <w:spacing w:after="40" w:line="264" w:lineRule="auto"/>
+            </w:pPr>
+            <w:r>
+              <w:rPr>
+                <w:b/>
+                <w:bCs/>
+                <w:sz w:val="19"/>
+                <w:szCs w:val="19"/>
+              </w:rPr>
+              <w:t xml:space="preserve">2. Тэргүүний суралцагч тэмдэг</w:t>
+            </w:r>
+          </w:p>
+        </w:tc>
+        <w:tc>
+          <w:tcPr>
+            <w:tcW w:w="3800" w:type="dxa"/>
+            <w:tcBorders>
+              <w:top w:val="single" w:sz="4" w:space="0" w:color="A9B1BD"/>
+              <w:left w:val="single" w:sz="4" w:space="0" w:color="A9B1BD"/>
+              <w:bottom w:val="single" w:sz="4" w:space="0" w:color="A9B1BD"/>
+              <w:right w:val="single" w:sz="4" w:space="0" w:color="A9B1BD"/>
+            </w:tcBorders>
+            <w:tcMar>
+              <w:top w:w="70" w:type="dxa"/>
+              <w:left w:w="100" w:type="dxa"/>
+              <w:bottom w:w="70" w:type="dxa"/>
+              <w:right w:w="100" w:type="dxa"/>
+            </w:tcMar>
+          </w:tcPr>
+          <w:p>
+            <w:pPr>
+              <w:spacing w:after="40" w:line="264" w:lineRule="auto"/>
+            </w:pPr>
+            <w:r>
+              <w:rPr>
+                <w:sz w:val="19"/>
+                <w:szCs w:val="19"/>
+              </w:rPr>
+              <w:t xml:space="preserve">Гэрэл цацруулж буй </w:t>
+            </w:r>
+            <w:r>
+              <w:rPr>
+                <w:b/>
+                <w:bCs/>
+                <w:sz w:val="19"/>
+                <w:szCs w:val="19"/>
+              </w:rPr>
+              <w:t xml:space="preserve">мэдлэгийн зул</w:t>
+            </w:r>
+            <w:r>
+              <w:rPr>
+                <w:sz w:val="19"/>
+                <w:szCs w:val="19"/>
+              </w:rPr>
+              <w:t xml:space="preserve">, </w:t>
+            </w:r>
+            <w:r>
+              <w:rPr>
+                <w:b/>
+                <w:bCs/>
+                <w:sz w:val="19"/>
+                <w:szCs w:val="19"/>
+              </w:rPr>
+              <w:t xml:space="preserve">нээлттэй ном</w:t>
+            </w:r>
+            <w:r>
+              <w:rPr>
+                <w:sz w:val="19"/>
+                <w:szCs w:val="19"/>
+              </w:rPr>
+              <w:t xml:space="preserve"> — эрдэм ном; бамбай хэлбэр, хөх паалан, улаан туузанд «ҮБХИС». 36 × 44 мм.</w:t>
+            </w:r>
+          </w:p>
+        </w:tc>
+        <w:tc>
+          <w:tcPr>
+            <w:tcW w:w="3800" w:type="dxa"/>
+            <w:tcBorders>
+              <w:top w:val="single" w:sz="4" w:space="0" w:color="A9B1BD"/>
+              <w:left w:val="single" w:sz="4" w:space="0" w:color="A9B1BD"/>
+              <w:bottom w:val="single" w:sz="4" w:space="0" w:color="A9B1BD"/>
+              <w:right w:val="single" w:sz="4" w:space="0" w:color="A9B1BD"/>
+            </w:tcBorders>
+            <w:tcMar>
+              <w:top w:w="70" w:type="dxa"/>
+              <w:left w:w="100" w:type="dxa"/>
+              <w:bottom w:w="70" w:type="dxa"/>
+              <w:right w:w="100" w:type="dxa"/>
+            </w:tcMar>
+          </w:tcPr>
+          <w:p>
+            <w:pPr>
+              <w:spacing w:after="40" w:line="264" w:lineRule="auto"/>
+              <w:rPr>
+                <w:lang w:val="ru-RU"/>
+              </w:rPr>
+            </w:pPr>
+            <w:r>
+              <w:rPr>
+                <w:sz w:val="19"/>
+                <w:szCs w:val="19"/>
+              </w:rPr>
+              <w:t xml:space="preserve">Семестрийн голч дүн ≥ 3.5 (4.0 оноогоор), «F» үнэлгээгүй, бүх хичээлээ хугацаандаа өгсөн.</w:t>
+            </w:r>
+          </w:p>
+        </w:tc>
+      </w:tr>
+      <w:tr>
+        <w:tblPrEx>
+          <w:tblCellMar>
+            <w:top w:w="0" w:type="dxa"/>
+            <w:bottom w:w="0" w:type="dxa"/>
+          </w:tblCellMar>
+        </w:tblPrEx>
+        <w:trPr>
+          <w:cantSplit/>
+        </w:trPr>
+        <w:tc>
+          <w:tcPr>
+            <w:tcW w:w="2038" w:type="dxa"/>
+            <w:tcBorders>
+              <w:top w:val="single" w:sz="4" w:space="0" w:color="A9B1BD"/>
+              <w:left w:val="single" w:sz="4" w:space="0" w:color="A9B1BD"/>
+              <w:bottom w:val="single" w:sz="4" w:space="0" w:color="A9B1BD"/>
+              <w:right w:val="single" w:sz="4" w:space="0" w:color="A9B1BD"/>
+            </w:tcBorders>
+            <w:shd w:val="clear" w:color="auto" w:fill="EEF0F4"/>
+            <w:tcMar>
+              <w:top w:w="70" w:type="dxa"/>
+              <w:left w:w="100" w:type="dxa"/>
+              <w:bottom w:w="70" w:type="dxa"/>
+              <w:right w:w="100" w:type="dxa"/>
+            </w:tcMar>
+          </w:tcPr>
+          <w:p>
+            <w:pPr>
+              <w:spacing w:after="40" w:line="264" w:lineRule="auto"/>
+            </w:pPr>
+            <w:r>
+              <w:rPr>
+                <w:b/>
+                <w:bCs/>
+                <w:sz w:val="19"/>
+                <w:szCs w:val="19"/>
+              </w:rPr>
+              <w:t xml:space="preserve">3. Жанжин Сүхбаатарын хүндэт тэмдэг</w:t>
+            </w:r>
+          </w:p>
+        </w:tc>
+        <w:tc>
+          <w:tcPr>
+            <w:tcW w:w="3800" w:type="dxa"/>
+            <w:tcBorders>
+              <w:top w:val="single" w:sz="4" w:space="0" w:color="A9B1BD"/>
+              <w:left w:val="single" w:sz="4" w:space="0" w:color="A9B1BD"/>
+              <w:bottom w:val="single" w:sz="4" w:space="0" w:color="A9B1BD"/>
+              <w:right w:val="single" w:sz="4" w:space="0" w:color="A9B1BD"/>
+            </w:tcBorders>
+            <w:tcMar>
+              <w:top w:w="70" w:type="dxa"/>
+              <w:left w:w="100" w:type="dxa"/>
+              <w:bottom w:w="70" w:type="dxa"/>
+              <w:right w:w="100" w:type="dxa"/>
+            </w:tcMar>
+          </w:tcPr>
+          <w:p>
+            <w:pPr>
+              <w:spacing w:after="40" w:line="264" w:lineRule="auto"/>
+            </w:pPr>
+            <w:r>
+              <w:rPr>
+                <w:sz w:val="19"/>
+                <w:szCs w:val="19"/>
+              </w:rPr>
+              <w:t xml:space="preserve">Жанжин </w:t>
+            </w:r>
+            <w:r>
+              <w:rPr>
+                <w:b/>
+                <w:bCs/>
+                <w:sz w:val="19"/>
+                <w:szCs w:val="19"/>
+              </w:rPr>
+              <w:t xml:space="preserve">Д.Сүхбаатарын морьт хөшөө</w:t>
+            </w:r>
+            <w:r>
+              <w:rPr>
+                <w:sz w:val="19"/>
+                <w:szCs w:val="19"/>
+              </w:rPr>
+              <w:t xml:space="preserve">, «1921» он — ҮБХИС-ийн үүсэл, эх оронч үзэл; улаан паалантай бүс, царс навч. Дугуй, Ø 44 мм.</w:t>
+            </w:r>
+          </w:p>
+        </w:tc>
+        <w:tc>
+          <w:tcPr>
+            <w:tcW w:w="3800" w:type="dxa"/>
+            <w:tcBorders>
+              <w:top w:val="single" w:sz="4" w:space="0" w:color="A9B1BD"/>
+              <w:left w:val="single" w:sz="4" w:space="0" w:color="A9B1BD"/>
+              <w:bottom w:val="single" w:sz="4" w:space="0" w:color="A9B1BD"/>
+              <w:right w:val="single" w:sz="4" w:space="0" w:color="A9B1BD"/>
+            </w:tcBorders>
+            <w:tcMar>
+              <w:top w:w="70" w:type="dxa"/>
+              <w:left w:w="100" w:type="dxa"/>
+              <w:bottom w:w="70" w:type="dxa"/>
+              <w:right w:w="100" w:type="dxa"/>
+            </w:tcMar>
+          </w:tcPr>
+          <w:p>
+            <w:pPr>
+              <w:spacing w:after="40" w:line="264" w:lineRule="auto"/>
+              <w:rPr>
+                <w:lang w:val="ru-RU"/>
+              </w:rPr>
+            </w:pPr>
+            <w:r>
+              <w:rPr>
+                <w:sz w:val="19"/>
+                <w:szCs w:val="19"/>
+              </w:rPr>
+              <w:t xml:space="preserve">Сурлага, цэргийн бэлтгэл, бие бялдар, ёс зүйн бүх үзүүлэлтээр тэргүүлж, эх оронч үйлсэд онцгой гавьяа байгуулсан; хорооноос жилд 3-аас ихгүй, ҮБХИС-ийн захирлын тушаалаар.</w:t>
+            </w:r>
+          </w:p>
+        </w:tc>
+      </w:tr>
+      <w:tr>
+        <w:tblPrEx>
+          <w:tblCellMar>
+            <w:top w:w="0" w:type="dxa"/>
+            <w:bottom w:w="0" w:type="dxa"/>
+          </w:tblCellMar>
+        </w:tblPrEx>
+        <w:trPr>
+          <w:cantSplit/>
+        </w:trPr>
+        <w:tc>
+          <w:tcPr>
+            <w:tcW w:w="2038" w:type="dxa"/>
+            <w:tcBorders>
+              <w:top w:val="single" w:sz="4" w:space="0" w:color="A9B1BD"/>
+              <w:left w:val="single" w:sz="4" w:space="0" w:color="A9B1BD"/>
+              <w:bottom w:val="single" w:sz="4" w:space="0" w:color="A9B1BD"/>
+              <w:right w:val="single" w:sz="4" w:space="0" w:color="A9B1BD"/>
+            </w:tcBorders>
+            <w:shd w:val="clear" w:color="auto" w:fill="EEF0F4"/>
+            <w:tcMar>
+              <w:top w:w="70" w:type="dxa"/>
+              <w:left w:w="100" w:type="dxa"/>
+              <w:bottom w:w="70" w:type="dxa"/>
+              <w:right w:w="100" w:type="dxa"/>
+            </w:tcMar>
+          </w:tcPr>
+          <w:p>
+            <w:pPr>
+              <w:spacing w:after="40" w:line="264" w:lineRule="auto"/>
+            </w:pPr>
+            <w:r>
+              <w:rPr>
+                <w:b/>
+                <w:bCs/>
+                <w:sz w:val="19"/>
+                <w:szCs w:val="19"/>
+              </w:rPr>
+              <w:t xml:space="preserve">4. Шилдэг төгсөгч шонхор тэмдэг</w:t>
+            </w:r>
+          </w:p>
+        </w:tc>
+        <w:tc>
+          <w:tcPr>
+            <w:tcW w:w="3800" w:type="dxa"/>
+            <w:tcBorders>
+              <w:top w:val="single" w:sz="4" w:space="0" w:color="A9B1BD"/>
+              <w:left w:val="single" w:sz="4" w:space="0" w:color="A9B1BD"/>
+              <w:bottom w:val="single" w:sz="4" w:space="0" w:color="A9B1BD"/>
+              <w:right w:val="single" w:sz="4" w:space="0" w:color="A9B1BD"/>
+            </w:tcBorders>
+            <w:tcMar>
+              <w:top w:w="70" w:type="dxa"/>
+              <w:left w:w="100" w:type="dxa"/>
+              <w:bottom w:w="70" w:type="dxa"/>
+              <w:right w:w="100" w:type="dxa"/>
+            </w:tcMar>
+          </w:tcPr>
+          <w:p>
+            <w:pPr>
+              <w:spacing w:after="40" w:line="264" w:lineRule="auto"/>
+            </w:pPr>
+            <w:r>
+              <w:rPr>
+                <w:sz w:val="19"/>
+                <w:szCs w:val="19"/>
+              </w:rPr>
+              <w:t xml:space="preserve">Одоо хэрэглэж буй загвар </w:t>
+            </w:r>
+            <w:r>
+              <w:rPr>
+                <w:b/>
+                <w:bCs/>
+                <w:sz w:val="19"/>
+                <w:szCs w:val="19"/>
+              </w:rPr>
+              <w:t xml:space="preserve">хэвээр</w:t>
+            </w:r>
+            <w:r>
+              <w:rPr>
+                <w:sz w:val="19"/>
+                <w:szCs w:val="19"/>
+              </w:rPr>
+              <w:t xml:space="preserve">: шонхортой өлгүүр, Соёмбо, «1921», загалмайлсан сэлэм, сүлд навч, ном, «ҮБХИС · ШИЛДЭГ ТӨГСӨГЧ» улаан паалан.</w:t>
+            </w:r>
+          </w:p>
+        </w:tc>
+        <w:tc>
+          <w:tcPr>
+            <w:tcW w:w="3800" w:type="dxa"/>
+            <w:tcBorders>
+              <w:top w:val="single" w:sz="4" w:space="0" w:color="A9B1BD"/>
+              <w:left w:val="single" w:sz="4" w:space="0" w:color="A9B1BD"/>
+              <w:bottom w:val="single" w:sz="4" w:space="0" w:color="A9B1BD"/>
+              <w:right w:val="single" w:sz="4" w:space="0" w:color="A9B1BD"/>
+            </w:tcBorders>
+            <w:tcMar>
+              <w:top w:w="70" w:type="dxa"/>
+              <w:left w:w="100" w:type="dxa"/>
+              <w:bottom w:w="70" w:type="dxa"/>
+              <w:right w:w="100" w:type="dxa"/>
+            </w:tcMar>
+          </w:tcPr>
+          <w:p>
+            <w:pPr>
+              <w:spacing w:after="40" w:line="264" w:lineRule="auto"/>
+              <w:rPr>
+                <w:lang w:val="ru-RU"/>
+              </w:rPr>
+            </w:pPr>
+            <w:r>
+              <w:rPr>
+                <w:sz w:val="19"/>
+                <w:szCs w:val="19"/>
+              </w:rPr>
+              <w:t xml:space="preserve">Төгсөлтийн «Цэргийн хөгжлийн нэгдсэн дүн»-гээр шалгарсан төгсөгчид төгсөлтийн ёслолоор (4.5-ыг үзнэ үү).</w:t>
+            </w:r>
+          </w:p>
+        </w:tc>
+      </w:tr>
+    </w:tbl>
+    <w:p>
+      <w:pPr>
+        <w:pStyle w:val="ListParagraph"/>
+        <w:numPr>
+          <w:ilvl w:val="0"/>
+          <w:numId w:val="2"/>
+        </w:numPr>
+        <w:spacing w:after="60" w:line="288" w:lineRule="auto"/>
+      </w:pPr>
+      <w:r>
+        <w:rPr>
+          <w:b/>
+          <w:bCs/>
+        </w:rPr>
+        <w:t xml:space="preserve">Ялгарал:</w:t>
+      </w:r>
+      <w:r>
+        <w:t xml:space="preserve"> шонхортой өлгүүр нь зөвхөн хамгийн дээд шагнал болох Шилдэг төгсөгч шонхор тэмдэгт байна; бусад нь өлгүүргүй, ар талдаа зүүлттэй энгэрийн тэмдэг.</w:t>
+      </w:r>
+    </w:p>
+    <w:p>
+      <w:pPr>
+        <w:pStyle w:val="ListParagraph"/>
+        <w:numPr>
+          <w:ilvl w:val="0"/>
+          <w:numId w:val="2"/>
+        </w:numPr>
+        <w:spacing w:after="60" w:line="288" w:lineRule="auto"/>
+      </w:pPr>
+      <w:r>
+        <w:rPr>
+          <w:b/>
+          <w:bCs/>
+        </w:rPr>
+        <w:t xml:space="preserve">Зүүх:</w:t>
+      </w:r>
+      <w:r>
+        <w:t xml:space="preserve"> баруун энгэрт, дээрээс доош 4 → 3 → 2 → 1 эрэмбээр. Нэг тэмдгийг дахин хүртвэл ар талд нь хүртсэн оныг сийлнэ.</w:t>
+      </w:r>
+    </w:p>
+    <w:p>
+      <w:pPr>
+        <w:pStyle w:val="ListParagraph"/>
+        <w:numPr>
+          <w:ilvl w:val="0"/>
+          <w:numId w:val="2"/>
+        </w:numPr>
+        <w:spacing w:after="60" w:line="288" w:lineRule="auto"/>
+      </w:pPr>
+      <w:r>
+        <w:rPr>
+          <w:b/>
+          <w:bCs/>
+        </w:rPr>
+        <w:t xml:space="preserve">Төрийн шагналтай андуурахгүй:</w:t>
+      </w:r>
+      <w:r>
+        <w:t xml:space="preserve"> таван хошуут од, хөрөг, туузан өлгүүр хэрэглэхгүй; Жанжин Сүхбаатарын хөргийн оронд түүний морьт хөшөөг дүрсэлсэн.</w:t>
+      </w:r>
+    </w:p>
+    <w:p>
       <w:r>
         <w:br w:type="page"/>
       </w:r>
@@ -11483,7 +12309,7 @@
           <w:sz w:val="18"/>
           <w:szCs w:val="18"/>
         </w:rPr>
-        <w:t xml:space="preserve">Зураг 10. Ялгах тэмдэг, шагналын тэмдгийг албаны хүрэмд зүүх байршлын схем</w:t>
+        <w:t xml:space="preserve">Зураг 11. Ялгах тэмдэг, шагналын тэмдгийг албаны хүрэмд зүүх байршлын схем</w:t>
       </w:r>
     </w:p>
     <w:p>
@@ -11499,7 +12325,7 @@
           <w:sz w:val="20"/>
           <w:szCs w:val="20"/>
         </w:rPr>
-        <w:t xml:space="preserve">Хүснэгт 7. Хувцасны төрлөөр зүүх тэмдэг</w:t>
+        <w:t xml:space="preserve">Хүснэгт 8. Хувцасны төрлөөр зүүх тэмдэг</w:t>
       </w:r>
     </w:p>
     <w:tbl>
@@ -12629,7 +13455,7 @@
           <w:sz w:val="20"/>
           <w:szCs w:val="20"/>
         </w:rPr>
-        <w:t xml:space="preserve">Хүснэгт 8. Баруун энгэрт зүүх эрэмбэ (дээрээс доош, голоос гадагш)</w:t>
+        <w:t xml:space="preserve">Хүснэгт 9. Баруун энгэрт зүүх эрэмбэ (дээрээс доош, голоос гадагш)</w:t>
       </w:r>
     </w:p>
     <w:tbl>

</xml_diff>

<commit_message>
Build all award badges on the best-graduate medal body
The athlete, student and General Sukhbaatar badges now reuse the existing
best-graduate medal (wreath, sabres, studded disc, 1921, ҮБХИС plaque,
red enamel band) and differ only in the centre symbol and the band name.
The falcon hanger stays on the best-graduate medal alone. Section 4.7
text and table follow the unified design.

Co-Authored-By: Claude Opus 5.5 <noreply@anthropic.com>
Claude-Session: https://claude.ai/code/session_019uvV65LEhrLAfTrsruz6Mp
</commit_message>
<xml_diff>
--- a/ubhis-yalgah-temdeg/ubhis_sonsogchiin_horoo_yalgah_temdeg.docx
+++ b/ubhis-yalgah-temdeg/ubhis_sonsogchiin_horoo_yalgah_temdeg.docx
@@ -11458,10 +11458,20 @@
           <w:b/>
           <w:bCs/>
         </w:rPr>
-        <w:t xml:space="preserve">«Шилдэг төгсөгч» шонхор тэмдэгтэй ижил хийцээр</w:t>
-      </w:r>
-      <w:r>
-        <w:t xml:space="preserve"> — хуучирсан гуулин өнгийн цутгамал металл, улаан ба хөх паалантайгаар хийнэ. Тэмдэг бүр өөрийн бэлгэдэлтэй бөгөөд «ҮБХИС» бичиг, улаан тууз нь нэгдмэл байдлыг хангана (Зураг 10, Хүснэгт 7).</w:t>
+        <w:t xml:space="preserve">«Шилдэг төгсөгч» медалийн хийц, хэлбэрээр</w:t>
+      </w:r>
+      <w:r>
+        <w:t xml:space="preserve"> нэг загвартай хийнэ: сүлд навч, загалмайлсан сэлэм, хадаастай дугуй, «1921», «ҮБХИС» ном, улаан паалантай нэрийн тууз, хуучирсан гуулин өнгийн цутгамал металл. Тэмдэг хооронд </w:t>
+      </w:r>
+      <w:r>
+        <w:rPr>
+          <w:b/>
+          <w:bCs/>
+        </w:rPr>
+        <w:t xml:space="preserve">зөвхөн голын бэлгэдэл ба туузан дээрх нэр</w:t>
+      </w:r>
+      <w:r>
+        <w:t xml:space="preserve"> ялгаатай (Зураг 10, Хүснэгт 7).</w:t>
       </w:r>
     </w:p>
     <w:p>
@@ -11476,7 +11486,7 @@
         </w:rPr>
         <w:drawing>
           <wp:inline distT="0" distB="0" distL="0" distR="0">
-            <wp:extent cx="6115050" cy="2547937"/>
+            <wp:extent cx="6115050" cy="2930128"/>
             <wp:effectExtent l="0" t="0" r="0" b="0"/>
             <wp:docPr id="2146811056" name="Picture 2146811056"/>
             <wp:cNvGraphicFramePr>
@@ -11501,7 +11511,7 @@
                   <pic:spPr bwMode="auto">
                     <a:xfrm>
                       <a:off x="0" y="0"/>
-                      <a:ext cx="6115050" cy="2547937"/>
+                      <a:ext cx="6115050" cy="2930128"/>
                     </a:xfrm>
                     <a:prstGeom prst="rect">
                       <a:avLst/>
@@ -11636,7 +11646,7 @@
                 <w:sz w:val="19"/>
                 <w:szCs w:val="19"/>
               </w:rPr>
-              <w:t xml:space="preserve">Бэлгэдэл, хийц</w:t>
+              <w:t xml:space="preserve">Голын бэлгэдэл ба туузан дээрх нэр</w:t>
             </w:r>
           </w:p>
         </w:tc>
@@ -11740,23 +11750,7 @@
                 <w:sz w:val="19"/>
                 <w:szCs w:val="19"/>
               </w:rPr>
-              <w:t xml:space="preserve">Бамбар барьж гүйж буй тамирчин — тэсвэр, ялалтын төлөөх тэмүүлэл; ялалтын </w:t>
-            </w:r>
-            <w:r>
-              <w:rPr>
-                <w:b/>
-                <w:bCs/>
-                <w:sz w:val="19"/>
-                <w:szCs w:val="19"/>
-              </w:rPr>
-              <w:t xml:space="preserve">сүлд навч</w:t>
-            </w:r>
-            <w:r>
-              <w:rPr>
-                <w:sz w:val="19"/>
-                <w:szCs w:val="19"/>
-              </w:rPr>
-              <w:t xml:space="preserve">; хөх паалан. Дугуй, Ø 40 мм.</w:t>
+              <w:t xml:space="preserve">Бамбар барьж гүйж буй тамирчин — тэсвэр, ялалтын төлөөх тэмүүлэл. Тууз: «ТЭРГҮҮНИЙ ТАМИРЧИН».</w:t>
             </w:r>
           </w:p>
         </w:tc>
@@ -11892,7 +11886,7 @@
                 <w:sz w:val="19"/>
                 <w:szCs w:val="19"/>
               </w:rPr>
-              <w:t xml:space="preserve"> — эрдэм ном; бамбай хэлбэр, хөх паалан, улаан туузанд «ҮБХИС». 36 × 44 мм.</w:t>
+              <w:t xml:space="preserve"> — эрдэм ном. Тууз: «ТЭРГҮҮНИЙ СУРАЛЦАГЧ».</w:t>
             </w:r>
           </w:p>
         </w:tc>
@@ -11993,26 +11987,19 @@
             </w:pPr>
             <w:r>
               <w:rPr>
-                <w:sz w:val="19"/>
-                <w:szCs w:val="19"/>
-              </w:rPr>
-              <w:t xml:space="preserve">Жанжин </w:t>
-            </w:r>
-            <w:r>
-              <w:rPr>
                 <w:b/>
                 <w:bCs/>
                 <w:sz w:val="19"/>
                 <w:szCs w:val="19"/>
               </w:rPr>
-              <w:t xml:space="preserve">Д.Сүхбаатарын морьт хөшөө</w:t>
-            </w:r>
-            <w:r>
-              <w:rPr>
-                <w:sz w:val="19"/>
-                <w:szCs w:val="19"/>
-              </w:rPr>
-              <w:t xml:space="preserve">, «1921» он — ҮБХИС-ийн үүсэл, эх оронч үзэл; улаан паалантай бүс, царс навч. Дугуй, Ø 44 мм.</w:t>
+              <w:t xml:space="preserve">Жанжин Д.Сүхбаатар</w:t>
+            </w:r>
+            <w:r>
+              <w:rPr>
+                <w:sz w:val="19"/>
+                <w:szCs w:val="19"/>
+              </w:rPr>
+              <w:t xml:space="preserve"> — ҮБХИС-ийн үүсэл (1921), эх оронч үзэл. Тууз: «ЖАНЖИН СҮХБААТАР».</w:t>
             </w:r>
           </w:p>
         </w:tc>
@@ -12116,7 +12103,7 @@
                 <w:sz w:val="19"/>
                 <w:szCs w:val="19"/>
               </w:rPr>
-              <w:t xml:space="preserve">Одоо хэрэглэж буй загвар </w:t>
+              <w:t xml:space="preserve">Одоо хэрэглэж буй медаль </w:t>
             </w:r>
             <w:r>
               <w:rPr>
@@ -12132,7 +12119,7 @@
                 <w:sz w:val="19"/>
                 <w:szCs w:val="19"/>
               </w:rPr>
-              <w:t xml:space="preserve">: шонхортой өлгүүр, Соёмбо, «1921», загалмайлсан сэлэм, сүлд навч, ном, «ҮБХИС · ШИЛДЭГ ТӨГСӨГЧ» улаан паалан.</w:t>
+              <w:t xml:space="preserve">: Соёмбо, шонхортой өлгүүр. Тууз: «ШИЛДЭГ ТӨГСӨГЧ».</w:t>
             </w:r>
           </w:p>
         </w:tc>
@@ -12184,10 +12171,10 @@
           <w:b/>
           <w:bCs/>
         </w:rPr>
-        <w:t xml:space="preserve">Ялгарал:</w:t>
-      </w:r>
-      <w:r>
-        <w:t xml:space="preserve"> шонхортой өлгүүр нь зөвхөн хамгийн дээд шагнал болох Шилдэг төгсөгч шонхор тэмдэгт байна; бусад нь өлгүүргүй, ар талдаа зүүлттэй энгэрийн тэмдэг.</w:t>
+        <w:t xml:space="preserve">Шонхортой өлгүүр</w:t>
+      </w:r>
+      <w:r>
+        <w:t xml:space="preserve"> нь зөвхөн хамгийн дээд шагнал болох Шилдэг төгсөгч шонхор тэмдэгт байна; бусад гурав нь өлгүүргүй, ар талдаа зүүлттэй энгэрийн тэмдэг.</w:t>
       </w:r>
     </w:p>
     <w:p>
@@ -12227,7 +12214,7 @@
         <w:t xml:space="preserve">Төрийн шагналтай андуурахгүй:</w:t>
       </w:r>
       <w:r>
-        <w:t xml:space="preserve"> таван хошуут од, хөрөг, туузан өлгүүр хэрэглэхгүй; Жанжин Сүхбаатарын хөргийн оронд түүний морьт хөшөөг дүрсэлсэн.</w:t>
+        <w:t xml:space="preserve"> таван хошуут од, туузан өлгүүр хэрэглэхгүй.</w:t>
       </w:r>
     </w:p>
     <w:p>

</xml_diff>